<commit_message>
Added the following: 1. PH3101 Tutorial 1 and Midsem 2025 solution 2. PH3204 Experiment 5 Lab report pdf 3. PH3205 CT-1 Question-4 partly
</commit_message>
<xml_diff>
--- a/Semester_6/PH3204 (Electronics Lab)/Experiment 5/Experiment 5.docx
+++ b/Semester_6/PH3204 (Electronics Lab)/Experiment 5/Experiment 5.docx
@@ -97,7 +97,15 @@
     </w:p>
     <w:p>
       <w:r>
-        <w:t>Study of 555 Timer IC as Astable multivibrator with different frequency.</w:t>
+        <w:t xml:space="preserve">Study of 555 Timer IC as </w:t>
+      </w:r>
+      <w:proofErr w:type="spellStart"/>
+      <w:r>
+        <w:t>Astable</w:t>
+      </w:r>
+      <w:proofErr w:type="spellEnd"/>
+      <w:r>
+        <w:t xml:space="preserve"> multivibrator with different frequency.</w:t>
       </w:r>
     </w:p>
     <w:p>
@@ -142,7 +150,40 @@
         </w:numPr>
       </w:pPr>
       <w:r>
-        <w:t>Registers: 1 k, 10 k, 100 k, and 1 M</w:t>
+        <w:t>Registers: 1 k</w:t>
+      </w:r>
+      <w:r>
+        <w:rPr>
+          <w:rFonts w:cstheme="minorHAnsi"/>
+        </w:rPr>
+        <w:t>Ω</w:t>
+      </w:r>
+      <w:r>
+        <w:t>, 10 k</w:t>
+      </w:r>
+      <w:r>
+        <w:rPr>
+          <w:rFonts w:cstheme="minorHAnsi"/>
+        </w:rPr>
+        <w:t>Ω</w:t>
+      </w:r>
+      <w:r>
+        <w:t>, 100 k</w:t>
+      </w:r>
+      <w:r>
+        <w:rPr>
+          <w:rFonts w:cstheme="minorHAnsi"/>
+        </w:rPr>
+        <w:t>Ω</w:t>
+      </w:r>
+      <w:r>
+        <w:t>, and 1 M</w:t>
+      </w:r>
+      <w:r>
+        <w:rPr>
+          <w:rFonts w:cstheme="minorHAnsi"/>
+        </w:rPr>
+        <w:t>Ω</w:t>
       </w:r>
     </w:p>
     <w:p>
@@ -178,7 +219,13 @@
         </w:numPr>
       </w:pPr>
       <w:r>
-        <w:t>LED, 1 Nos</w:t>
+        <w:t>LED</w:t>
+      </w:r>
+      <w:r>
+        <w:t xml:space="preserve">: </w:t>
+      </w:r>
+      <w:r>
+        <w:t>1 Nos</w:t>
       </w:r>
     </w:p>
     <w:p>
@@ -755,6 +802,7 @@
           <w:numId w:val="2"/>
         </w:numPr>
       </w:pPr>
+      <w:proofErr w:type="spellStart"/>
       <w:r>
         <w:rPr>
           <w:b/>
@@ -762,6 +810,7 @@
         </w:rPr>
         <w:t>Astable</w:t>
       </w:r>
+      <w:proofErr w:type="spellEnd"/>
       <w:r>
         <w:t xml:space="preserve"> - producing a square wave</w:t>
       </w:r>
@@ -890,13 +939,26 @@
         <w:t>s</w:t>
       </w:r>
       <w:r>
-        <w:t xml:space="preserve"> ('active high') this makes the output low (0V)</w:t>
+        <w:t xml:space="preserve"> ('active high') this makes the output low (0</w:t>
+      </w:r>
+      <w:proofErr w:type="gramStart"/>
+      <w:r>
+        <w:t>V)</w:t>
       </w:r>
       <w:r>
         <w:t>*</w:t>
       </w:r>
-      <w:r>
-        <w:t>. It monitors the charging of the timing capacitor in astable and monostable circuits. It has a high input impedance &gt; 10M</w:t>
+      <w:proofErr w:type="gramEnd"/>
+      <w:r>
+        <w:t xml:space="preserve">. It monitors the charging of the timing capacitor in </w:t>
+      </w:r>
+      <w:proofErr w:type="spellStart"/>
+      <w:r>
+        <w:t>astable</w:t>
+      </w:r>
+      <w:proofErr w:type="spellEnd"/>
+      <w:r>
+        <w:t xml:space="preserve"> and monostable circuits. It has a high input impedance &gt; 10M</w:t>
       </w:r>
       <w:r>
         <w:rPr>
@@ -1057,7 +1119,15 @@
         <w:t>The discharge pin</w:t>
       </w:r>
       <w:r>
-        <w:t xml:space="preserve"> is not an input, but it is listed here for convenience. It is connected to 0V when the timer output is low and is used to discharge the timing capacitor in astable and monostable circuits.</w:t>
+        <w:t xml:space="preserve"> is not an input, but it is listed here for convenience. It is connected to 0V when the timer output is low and is used to discharge the timing capacitor in </w:t>
+      </w:r>
+      <w:proofErr w:type="spellStart"/>
+      <w:r>
+        <w:t>astable</w:t>
+      </w:r>
+      <w:proofErr w:type="spellEnd"/>
+      <w:r>
+        <w:t xml:space="preserve"> and monostable circuits.</w:t>
       </w:r>
     </w:p>
     <w:p/>
@@ -1279,6 +1349,7 @@
         </w:rPr>
         <w:t>f = 1.4</w:t>
       </w:r>
+      <w:proofErr w:type="gramStart"/>
       <w:r>
         <w:rPr>
           <w:rFonts w:ascii="Cambria Math" w:hAnsi="Cambria Math"/>
@@ -1287,6 +1358,7 @@
         </w:rPr>
         <w:t>/[</w:t>
       </w:r>
+      <w:proofErr w:type="gramEnd"/>
       <w:r>
         <w:rPr>
           <w:rFonts w:ascii="Cambria Math" w:hAnsi="Cambria Math"/>
@@ -2692,7 +2764,15 @@
               <w:t>m</w:t>
             </w:r>
             <w:r>
-              <w:t xml:space="preserve"> (Expt)</w:t>
+              <w:t xml:space="preserve"> (</w:t>
+            </w:r>
+            <w:proofErr w:type="spellStart"/>
+            <w:r>
+              <w:t>Expt</w:t>
+            </w:r>
+            <w:proofErr w:type="spellEnd"/>
+            <w:r>
+              <w:t>)</w:t>
             </w:r>
           </w:p>
         </w:tc>
@@ -2717,7 +2797,15 @@
               <w:t xml:space="preserve">s </w:t>
             </w:r>
             <w:r>
-              <w:t>(Expt)</w:t>
+              <w:t>(</w:t>
+            </w:r>
+            <w:proofErr w:type="spellStart"/>
+            <w:r>
+              <w:t>Expt</w:t>
+            </w:r>
+            <w:proofErr w:type="spellEnd"/>
+            <w:r>
+              <w:t>)</w:t>
             </w:r>
           </w:p>
         </w:tc>
@@ -2764,7 +2852,15 @@
               <w:cnfStyle w:val="100000000000" w:firstRow="1" w:lastRow="0" w:firstColumn="0" w:lastColumn="0" w:oddVBand="0" w:evenVBand="0" w:oddHBand="0" w:evenHBand="0" w:firstRowFirstColumn="0" w:firstRowLastColumn="0" w:lastRowFirstColumn="0" w:lastRowLastColumn="0"/>
             </w:pPr>
             <w:r>
-              <w:t>f (Expt)</w:t>
+              <w:t>f (</w:t>
+            </w:r>
+            <w:proofErr w:type="spellStart"/>
+            <w:r>
+              <w:t>Expt</w:t>
+            </w:r>
+            <w:proofErr w:type="spellEnd"/>
+            <w:r>
+              <w:t>)</w:t>
             </w:r>
           </w:p>
         </w:tc>
@@ -3269,8 +3365,13 @@
               <w:cnfStyle w:val="000000100000" w:firstRow="0" w:lastRow="0" w:firstColumn="0" w:lastColumn="0" w:oddVBand="0" w:evenVBand="0" w:oddHBand="1" w:evenHBand="0" w:firstRowFirstColumn="0" w:firstRowLastColumn="0" w:lastRowFirstColumn="0" w:lastRowLastColumn="0"/>
             </w:pPr>
             <w:r>
-              <w:t>1.256 ms</w:t>
-            </w:r>
+              <w:t xml:space="preserve">1.256 </w:t>
+            </w:r>
+            <w:proofErr w:type="spellStart"/>
+            <w:r>
+              <w:t>ms</w:t>
+            </w:r>
+            <w:proofErr w:type="spellEnd"/>
           </w:p>
         </w:tc>
         <w:tc>
@@ -3755,8 +3856,13 @@
               <w:cnfStyle w:val="000000000000" w:firstRow="0" w:lastRow="0" w:firstColumn="0" w:lastColumn="0" w:oddVBand="0" w:evenVBand="0" w:oddHBand="0" w:evenHBand="0" w:firstRowFirstColumn="0" w:firstRowLastColumn="0" w:lastRowFirstColumn="0" w:lastRowLastColumn="0"/>
             </w:pPr>
             <w:r>
-              <w:t>1.316 ms</w:t>
-            </w:r>
+              <w:t xml:space="preserve">1.316 </w:t>
+            </w:r>
+            <w:proofErr w:type="spellStart"/>
+            <w:r>
+              <w:t>ms</w:t>
+            </w:r>
+            <w:proofErr w:type="spellEnd"/>
           </w:p>
         </w:tc>
         <w:tc>
@@ -3897,8 +4003,13 @@
               <w:cnfStyle w:val="000000100000" w:firstRow="0" w:lastRow="0" w:firstColumn="0" w:lastColumn="0" w:oddVBand="0" w:evenVBand="0" w:oddHBand="1" w:evenHBand="0" w:firstRowFirstColumn="0" w:firstRowLastColumn="0" w:lastRowFirstColumn="0" w:lastRowLastColumn="0"/>
             </w:pPr>
             <w:r>
-              <w:t>6.76 ms</w:t>
-            </w:r>
+              <w:t xml:space="preserve">6.76 </w:t>
+            </w:r>
+            <w:proofErr w:type="spellStart"/>
+            <w:r>
+              <w:t>ms</w:t>
+            </w:r>
+            <w:proofErr w:type="spellEnd"/>
           </w:p>
         </w:tc>
         <w:tc>
@@ -3913,8 +4024,13 @@
               <w:cnfStyle w:val="000000100000" w:firstRow="0" w:lastRow="0" w:firstColumn="0" w:lastColumn="0" w:oddVBand="0" w:evenVBand="0" w:oddHBand="1" w:evenHBand="0" w:firstRowFirstColumn="0" w:firstRowLastColumn="0" w:lastRowFirstColumn="0" w:lastRowLastColumn="0"/>
             </w:pPr>
             <w:r>
-              <w:t>6.48 ms</w:t>
-            </w:r>
+              <w:t xml:space="preserve">6.48 </w:t>
+            </w:r>
+            <w:proofErr w:type="spellStart"/>
+            <w:r>
+              <w:t>ms</w:t>
+            </w:r>
+            <w:proofErr w:type="spellEnd"/>
           </w:p>
         </w:tc>
         <w:tc>
@@ -3929,8 +4045,13 @@
               <w:cnfStyle w:val="000000100000" w:firstRow="0" w:lastRow="0" w:firstColumn="0" w:lastColumn="0" w:oddVBand="0" w:evenVBand="0" w:oddHBand="1" w:evenHBand="0" w:firstRowFirstColumn="0" w:firstRowLastColumn="0" w:lastRowFirstColumn="0" w:lastRowLastColumn="0"/>
             </w:pPr>
             <w:r>
-              <w:t>13.2 ms</w:t>
-            </w:r>
+              <w:t xml:space="preserve">13.2 </w:t>
+            </w:r>
+            <w:proofErr w:type="spellStart"/>
+            <w:r>
+              <w:t>ms</w:t>
+            </w:r>
+            <w:proofErr w:type="spellEnd"/>
           </w:p>
         </w:tc>
         <w:tc>
@@ -4242,8 +4363,13 @@
               <w:cnfStyle w:val="000000100000" w:firstRow="0" w:lastRow="0" w:firstColumn="0" w:lastColumn="0" w:oddVBand="0" w:evenVBand="0" w:oddHBand="1" w:evenHBand="0" w:firstRowFirstColumn="0" w:firstRowLastColumn="0" w:lastRowFirstColumn="0" w:lastRowLastColumn="0"/>
             </w:pPr>
             <w:r>
-              <w:t>1.054 ms</w:t>
-            </w:r>
+              <w:t xml:space="preserve">1.054 </w:t>
+            </w:r>
+            <w:proofErr w:type="spellStart"/>
+            <w:r>
+              <w:t>ms</w:t>
+            </w:r>
+            <w:proofErr w:type="spellEnd"/>
           </w:p>
         </w:tc>
         <w:tc>
@@ -4383,8 +4509,13 @@
               <w:cnfStyle w:val="000000000000" w:firstRow="0" w:lastRow="0" w:firstColumn="0" w:lastColumn="0" w:oddVBand="0" w:evenVBand="0" w:oddHBand="0" w:evenHBand="0" w:firstRowFirstColumn="0" w:firstRowLastColumn="0" w:lastRowFirstColumn="0" w:lastRowLastColumn="0"/>
             </w:pPr>
             <w:r>
-              <w:t>4.7 ms</w:t>
-            </w:r>
+              <w:t xml:space="preserve">4.7 </w:t>
+            </w:r>
+            <w:proofErr w:type="spellStart"/>
+            <w:r>
+              <w:t>ms</w:t>
+            </w:r>
+            <w:proofErr w:type="spellEnd"/>
           </w:p>
         </w:tc>
         <w:tc>
@@ -4399,8 +4530,13 @@
               <w:cnfStyle w:val="000000000000" w:firstRow="0" w:lastRow="0" w:firstColumn="0" w:lastColumn="0" w:oddVBand="0" w:evenVBand="0" w:oddHBand="0" w:evenHBand="0" w:firstRowFirstColumn="0" w:firstRowLastColumn="0" w:lastRowFirstColumn="0" w:lastRowLastColumn="0"/>
             </w:pPr>
             <w:r>
-              <w:t>4.76 ms</w:t>
-            </w:r>
+              <w:t xml:space="preserve">4.76 </w:t>
+            </w:r>
+            <w:proofErr w:type="spellStart"/>
+            <w:r>
+              <w:t>ms</w:t>
+            </w:r>
+            <w:proofErr w:type="spellEnd"/>
           </w:p>
         </w:tc>
         <w:tc>
@@ -4415,8 +4551,13 @@
               <w:cnfStyle w:val="000000000000" w:firstRow="0" w:lastRow="0" w:firstColumn="0" w:lastColumn="0" w:oddVBand="0" w:evenVBand="0" w:oddHBand="0" w:evenHBand="0" w:firstRowFirstColumn="0" w:firstRowLastColumn="0" w:lastRowFirstColumn="0" w:lastRowLastColumn="0"/>
             </w:pPr>
             <w:r>
-              <w:t>9.46 ms</w:t>
-            </w:r>
+              <w:t xml:space="preserve">9.46 </w:t>
+            </w:r>
+            <w:proofErr w:type="spellStart"/>
+            <w:r>
+              <w:t>ms</w:t>
+            </w:r>
+            <w:proofErr w:type="spellEnd"/>
           </w:p>
         </w:tc>
         <w:tc>
@@ -4557,8 +4698,13 @@
               <w:cnfStyle w:val="000000100000" w:firstRow="0" w:lastRow="0" w:firstColumn="0" w:lastColumn="0" w:oddVBand="0" w:evenVBand="0" w:oddHBand="1" w:evenHBand="0" w:firstRowFirstColumn="0" w:firstRowLastColumn="0" w:lastRowFirstColumn="0" w:lastRowLastColumn="0"/>
             </w:pPr>
             <w:r>
-              <w:t>60.3 ms</w:t>
-            </w:r>
+              <w:t xml:space="preserve">60.3 </w:t>
+            </w:r>
+            <w:proofErr w:type="spellStart"/>
+            <w:r>
+              <w:t>ms</w:t>
+            </w:r>
+            <w:proofErr w:type="spellEnd"/>
           </w:p>
         </w:tc>
         <w:tc>
@@ -4573,8 +4719,13 @@
               <w:cnfStyle w:val="000000100000" w:firstRow="0" w:lastRow="0" w:firstColumn="0" w:lastColumn="0" w:oddVBand="0" w:evenVBand="0" w:oddHBand="1" w:evenHBand="0" w:firstRowFirstColumn="0" w:firstRowLastColumn="0" w:lastRowFirstColumn="0" w:lastRowLastColumn="0"/>
             </w:pPr>
             <w:r>
-              <w:t>57.4 ms</w:t>
-            </w:r>
+              <w:t xml:space="preserve">57.4 </w:t>
+            </w:r>
+            <w:proofErr w:type="spellStart"/>
+            <w:r>
+              <w:t>ms</w:t>
+            </w:r>
+            <w:proofErr w:type="spellEnd"/>
           </w:p>
         </w:tc>
         <w:tc>
@@ -4589,8 +4740,13 @@
               <w:cnfStyle w:val="000000100000" w:firstRow="0" w:lastRow="0" w:firstColumn="0" w:lastColumn="0" w:oddVBand="0" w:evenVBand="0" w:oddHBand="1" w:evenHBand="0" w:firstRowFirstColumn="0" w:firstRowLastColumn="0" w:lastRowFirstColumn="0" w:lastRowLastColumn="0"/>
             </w:pPr>
             <w:r>
-              <w:t>118 ms</w:t>
-            </w:r>
+              <w:t xml:space="preserve">118 </w:t>
+            </w:r>
+            <w:proofErr w:type="spellStart"/>
+            <w:r>
+              <w:t>ms</w:t>
+            </w:r>
+            <w:proofErr w:type="spellEnd"/>
           </w:p>
         </w:tc>
         <w:tc>
@@ -4870,8 +5026,13 @@
               <w:cnfStyle w:val="000000100000" w:firstRow="0" w:lastRow="0" w:firstColumn="0" w:lastColumn="0" w:oddVBand="0" w:evenVBand="0" w:oddHBand="1" w:evenHBand="0" w:firstRowFirstColumn="0" w:firstRowLastColumn="0" w:lastRowFirstColumn="0" w:lastRowLastColumn="0"/>
             </w:pPr>
             <w:r>
-              <w:t>7.16 ms</w:t>
-            </w:r>
+              <w:t xml:space="preserve">7.16 </w:t>
+            </w:r>
+            <w:proofErr w:type="spellStart"/>
+            <w:r>
+              <w:t>ms</w:t>
+            </w:r>
+            <w:proofErr w:type="spellEnd"/>
           </w:p>
         </w:tc>
         <w:tc>
@@ -4886,8 +5047,13 @@
               <w:cnfStyle w:val="000000100000" w:firstRow="0" w:lastRow="0" w:firstColumn="0" w:lastColumn="0" w:oddVBand="0" w:evenVBand="0" w:oddHBand="1" w:evenHBand="0" w:firstRowFirstColumn="0" w:firstRowLastColumn="0" w:lastRowFirstColumn="0" w:lastRowLastColumn="0"/>
             </w:pPr>
             <w:r>
-              <w:t>6.68 ms</w:t>
-            </w:r>
+              <w:t xml:space="preserve">6.68 </w:t>
+            </w:r>
+            <w:proofErr w:type="spellStart"/>
+            <w:r>
+              <w:t>ms</w:t>
+            </w:r>
+            <w:proofErr w:type="spellEnd"/>
           </w:p>
         </w:tc>
         <w:tc>
@@ -4902,8 +5068,13 @@
               <w:cnfStyle w:val="000000100000" w:firstRow="0" w:lastRow="0" w:firstColumn="0" w:lastColumn="0" w:oddVBand="0" w:evenVBand="0" w:oddHBand="1" w:evenHBand="0" w:firstRowFirstColumn="0" w:firstRowLastColumn="0" w:lastRowFirstColumn="0" w:lastRowLastColumn="0"/>
             </w:pPr>
             <w:r>
-              <w:t>13.840 ms</w:t>
-            </w:r>
+              <w:t xml:space="preserve">13.840 </w:t>
+            </w:r>
+            <w:proofErr w:type="spellStart"/>
+            <w:r>
+              <w:t>ms</w:t>
+            </w:r>
+            <w:proofErr w:type="spellEnd"/>
           </w:p>
         </w:tc>
         <w:tc>
@@ -5044,8 +5215,13 @@
               <w:cnfStyle w:val="000000000000" w:firstRow="0" w:lastRow="0" w:firstColumn="0" w:lastColumn="0" w:oddVBand="0" w:evenVBand="0" w:oddHBand="0" w:evenHBand="0" w:firstRowFirstColumn="0" w:firstRowLastColumn="0" w:lastRowFirstColumn="0" w:lastRowLastColumn="0"/>
             </w:pPr>
             <w:r>
-              <w:t>65.8 ms</w:t>
-            </w:r>
+              <w:t xml:space="preserve">65.8 </w:t>
+            </w:r>
+            <w:proofErr w:type="spellStart"/>
+            <w:r>
+              <w:t>ms</w:t>
+            </w:r>
+            <w:proofErr w:type="spellEnd"/>
           </w:p>
         </w:tc>
         <w:tc>
@@ -5060,8 +5236,13 @@
               <w:cnfStyle w:val="000000000000" w:firstRow="0" w:lastRow="0" w:firstColumn="0" w:lastColumn="0" w:oddVBand="0" w:evenVBand="0" w:oddHBand="0" w:evenHBand="0" w:firstRowFirstColumn="0" w:firstRowLastColumn="0" w:lastRowFirstColumn="0" w:lastRowLastColumn="0"/>
             </w:pPr>
             <w:r>
-              <w:t>62.6 ms</w:t>
-            </w:r>
+              <w:t xml:space="preserve">62.6 </w:t>
+            </w:r>
+            <w:proofErr w:type="spellStart"/>
+            <w:r>
+              <w:t>ms</w:t>
+            </w:r>
+            <w:proofErr w:type="spellEnd"/>
           </w:p>
         </w:tc>
         <w:tc>
@@ -5076,8 +5257,13 @@
               <w:cnfStyle w:val="000000000000" w:firstRow="0" w:lastRow="0" w:firstColumn="0" w:lastColumn="0" w:oddVBand="0" w:evenVBand="0" w:oddHBand="0" w:evenHBand="0" w:firstRowFirstColumn="0" w:firstRowLastColumn="0" w:lastRowFirstColumn="0" w:lastRowLastColumn="0"/>
             </w:pPr>
             <w:r>
-              <w:t>128.4 ms</w:t>
-            </w:r>
+              <w:t xml:space="preserve">128.4 </w:t>
+            </w:r>
+            <w:proofErr w:type="spellStart"/>
+            <w:r>
+              <w:t>ms</w:t>
+            </w:r>
+            <w:proofErr w:type="spellEnd"/>
           </w:p>
         </w:tc>
         <w:tc>
@@ -5218,8 +5404,13 @@
               <w:cnfStyle w:val="000000100000" w:firstRow="0" w:lastRow="0" w:firstColumn="0" w:lastColumn="0" w:oddVBand="0" w:evenVBand="0" w:oddHBand="1" w:evenHBand="0" w:firstRowFirstColumn="0" w:firstRowLastColumn="0" w:lastRowFirstColumn="0" w:lastRowLastColumn="0"/>
             </w:pPr>
             <w:r>
-              <w:t>676 ms</w:t>
-            </w:r>
+              <w:t xml:space="preserve">676 </w:t>
+            </w:r>
+            <w:proofErr w:type="spellStart"/>
+            <w:r>
+              <w:t>ms</w:t>
+            </w:r>
+            <w:proofErr w:type="spellEnd"/>
           </w:p>
         </w:tc>
         <w:tc>
@@ -5234,8 +5425,13 @@
               <w:cnfStyle w:val="000000100000" w:firstRow="0" w:lastRow="0" w:firstColumn="0" w:lastColumn="0" w:oddVBand="0" w:evenVBand="0" w:oddHBand="1" w:evenHBand="0" w:firstRowFirstColumn="0" w:firstRowLastColumn="0" w:lastRowFirstColumn="0" w:lastRowLastColumn="0"/>
             </w:pPr>
             <w:r>
-              <w:t>632 ms</w:t>
-            </w:r>
+              <w:t xml:space="preserve">632 </w:t>
+            </w:r>
+            <w:proofErr w:type="spellStart"/>
+            <w:r>
+              <w:t>ms</w:t>
+            </w:r>
+            <w:proofErr w:type="spellEnd"/>
           </w:p>
         </w:tc>
         <w:tc>
@@ -5531,8 +5727,13 @@
               <w:cnfStyle w:val="000000100000" w:firstRow="0" w:lastRow="0" w:firstColumn="0" w:lastColumn="0" w:oddVBand="0" w:evenVBand="0" w:oddHBand="1" w:evenHBand="0" w:firstRowFirstColumn="0" w:firstRowLastColumn="0" w:lastRowFirstColumn="0" w:lastRowLastColumn="0"/>
             </w:pPr>
             <w:r>
-              <w:t>74.4 ms</w:t>
-            </w:r>
+              <w:t xml:space="preserve">74.4 </w:t>
+            </w:r>
+            <w:proofErr w:type="spellStart"/>
+            <w:r>
+              <w:t>ms</w:t>
+            </w:r>
+            <w:proofErr w:type="spellEnd"/>
           </w:p>
         </w:tc>
         <w:tc>
@@ -5547,8 +5748,13 @@
               <w:cnfStyle w:val="000000100000" w:firstRow="0" w:lastRow="0" w:firstColumn="0" w:lastColumn="0" w:oddVBand="0" w:evenVBand="0" w:oddHBand="1" w:evenHBand="0" w:firstRowFirstColumn="0" w:firstRowLastColumn="0" w:lastRowFirstColumn="0" w:lastRowLastColumn="0"/>
             </w:pPr>
             <w:r>
-              <w:t>69.8 ms</w:t>
-            </w:r>
+              <w:t xml:space="preserve">69.8 </w:t>
+            </w:r>
+            <w:proofErr w:type="spellStart"/>
+            <w:r>
+              <w:t>ms</w:t>
+            </w:r>
+            <w:proofErr w:type="spellEnd"/>
           </w:p>
         </w:tc>
         <w:tc>
@@ -5563,8 +5769,13 @@
               <w:cnfStyle w:val="000000100000" w:firstRow="0" w:lastRow="0" w:firstColumn="0" w:lastColumn="0" w:oddVBand="0" w:evenVBand="0" w:oddHBand="1" w:evenHBand="0" w:firstRowFirstColumn="0" w:firstRowLastColumn="0" w:lastRowFirstColumn="0" w:lastRowLastColumn="0"/>
             </w:pPr>
             <w:r>
-              <w:t>144.2 ms</w:t>
-            </w:r>
+              <w:t xml:space="preserve">144.2 </w:t>
+            </w:r>
+            <w:proofErr w:type="spellStart"/>
+            <w:r>
+              <w:t>ms</w:t>
+            </w:r>
+            <w:proofErr w:type="spellEnd"/>
           </w:p>
         </w:tc>
         <w:tc>
@@ -5704,8 +5915,13 @@
               <w:cnfStyle w:val="000000000000" w:firstRow="0" w:lastRow="0" w:firstColumn="0" w:lastColumn="0" w:oddVBand="0" w:evenVBand="0" w:oddHBand="0" w:evenHBand="0" w:firstRowFirstColumn="0" w:firstRowLastColumn="0" w:lastRowFirstColumn="0" w:lastRowLastColumn="0"/>
             </w:pPr>
             <w:r>
-              <w:t>676 ms</w:t>
-            </w:r>
+              <w:t xml:space="preserve">676 </w:t>
+            </w:r>
+            <w:proofErr w:type="spellStart"/>
+            <w:r>
+              <w:t>ms</w:t>
+            </w:r>
+            <w:proofErr w:type="spellEnd"/>
           </w:p>
         </w:tc>
         <w:tc>
@@ -5720,8 +5936,13 @@
               <w:cnfStyle w:val="000000000000" w:firstRow="0" w:lastRow="0" w:firstColumn="0" w:lastColumn="0" w:oddVBand="0" w:evenVBand="0" w:oddHBand="0" w:evenHBand="0" w:firstRowFirstColumn="0" w:firstRowLastColumn="0" w:lastRowFirstColumn="0" w:lastRowLastColumn="0"/>
             </w:pPr>
             <w:r>
-              <w:t>662 ms</w:t>
-            </w:r>
+              <w:t xml:space="preserve">662 </w:t>
+            </w:r>
+            <w:proofErr w:type="spellStart"/>
+            <w:r>
+              <w:t>ms</w:t>
+            </w:r>
+            <w:proofErr w:type="spellEnd"/>
           </w:p>
         </w:tc>
         <w:tc>
@@ -6040,13 +6261,7 @@
           <w:rPr>
             <w:rFonts w:ascii="Cambria Math" w:hAnsi="Cambria Math"/>
           </w:rPr>
-          <m:t>R</m:t>
-        </m:r>
-        <m:r>
-          <w:rPr>
-            <w:rFonts w:ascii="Cambria Math" w:hAnsi="Cambria Math"/>
-          </w:rPr>
-          <m:t xml:space="preserve"> </m:t>
+          <m:t xml:space="preserve">R </m:t>
         </m:r>
       </m:oMath>
       <w:r>
@@ -7531,6 +7746,7 @@
   <w:style w:type="character" w:default="1" w:styleId="DefaultParagraphFont">
     <w:name w:val="Default Paragraph Font"/>
     <w:uiPriority w:val="1"/>
+    <w:semiHidden/>
     <w:unhideWhenUsed/>
   </w:style>
   <w:style w:type="table" w:default="1" w:styleId="TableNormal">

</xml_diff>